<commit_message>
Before rollout: the way home in all three, and three additions to Volunteers & Events
Every program's Help now links the NAMI landing page (Radar on its Start
here view, the Dashboard in its Guides list, Volunteers & Events in Help
and on More). The landing page names who looks after each program and
what it replaces, and grows a feedback button once an address is set.
Volunteers & Events 2.2: a printable sign-in sheet from an event, a For
the board page with the year in four lines, and a value-of-one-volunteer-
hour setting that puts dollars on the hours reports. 31 browser steps
pass; Radar's 25 tests pass; the shared page is republished (version 3).
Radar's guide files travel with it to the landing site.

Co-Authored-By: Claude Fable 5.1 <noreply@anthropic.com>
Claude-Session: https://claude.ai/code/session_01NQwyA57oAsCk3BA8fwH8DZ
</commit_message>
<xml_diff>
--- a/guides/dist/NAMI_Dashboard_Suite_Quick_Start_Guides.docx
+++ b/guides/dist/NAMI_Dashboard_Suite_Quick_Start_Guides.docx
@@ -1221,6 +1221,64 @@
       </w:r>
       <w:r>
         <w:t>.</w:t>
+      </w:r>
+      <w:r>
+        <w:br/>
+      </w:r>
+    </w:p>
+    <w:p>
+      <w:pPr>
+        <w:ind w:left="403" w:hanging="288"/>
+      </w:pPr>
+      <w:r>
+        <w:t xml:space="preserve">•  </w:t>
+      </w:r>
+      <w:r>
+        <w:rPr>
+          <w:b/>
+        </w:rPr>
+        <w:t>A big event at the door?</w:t>
+      </w:r>
+      <w:r>
+        <w:t xml:space="preserve"> On the event, tap </w:t>
+      </w:r>
+      <w:r>
+        <w:rPr>
+          <w:b/>
+        </w:rPr>
+        <w:t>Print a sign-in sheet</w:t>
+      </w:r>
+      <w:r>
+        <w:t>. After the event, type what the sheet says back in.</w:t>
+      </w:r>
+      <w:r>
+        <w:br/>
+      </w:r>
+    </w:p>
+    <w:p>
+      <w:pPr>
+        <w:ind w:left="403" w:hanging="288"/>
+      </w:pPr>
+      <w:r>
+        <w:t xml:space="preserve">•  </w:t>
+      </w:r>
+      <w:r>
+        <w:rPr>
+          <w:b/>
+        </w:rPr>
+        <w:t>A board update or a grant report?</w:t>
+      </w:r>
+      <w:r>
+        <w:t xml:space="preserve"> </w:t>
+      </w:r>
+      <w:r>
+        <w:rPr>
+          <w:b/>
+        </w:rPr>
+        <w:t>More → For the board</w:t>
+      </w:r>
+      <w:r>
+        <w:t xml:space="preserve"> gives you the year in four lines. Set the value of one volunteer hour in Settings and the hours show in dollars too.</w:t>
       </w:r>
       <w:r>
         <w:br/>

</xml_diff>